<commit_message>
Updating register_order_step both yml and docx - inconsistent signing paragraphs
</commit_message>
<xml_diff>
--- a/docassemble/AKA2JBranding/data/templates/register_order_content.docx
+++ b/docassemble/AKA2JBranding/data/templates/register_order_content.docx
@@ -473,7 +473,21 @@
         <w:rPr>
           <w:color w:val="FF0000"/>
         </w:rPr>
-        <w:t xml:space="preserve"> and foreign_court_type == 'other state'</w:t>
+        <w:t xml:space="preserve"> and </w:t>
+      </w:r>
+      <w:proofErr w:type="spellStart"/>
+      <w:r>
+        <w:rPr>
+          <w:color w:val="FF0000"/>
+        </w:rPr>
+        <w:t>foreign_court_type</w:t>
+      </w:r>
+      <w:proofErr w:type="spellEnd"/>
+      <w:r>
+        <w:rPr>
+          <w:color w:val="FF0000"/>
+        </w:rPr>
+        <w:t xml:space="preserve"> == 'other state'</w:t>
       </w:r>
       <w:r>
         <w:rPr>
@@ -607,7 +621,21 @@
         <w:rPr>
           <w:color w:val="FF0000"/>
         </w:rPr>
-        <w:t>' and foreign_court_type == 'tribal' %}</w:t>
+        <w:t xml:space="preserve">' and </w:t>
+      </w:r>
+      <w:proofErr w:type="spellStart"/>
+      <w:r>
+        <w:rPr>
+          <w:color w:val="FF0000"/>
+        </w:rPr>
+        <w:t>foreign_court_type</w:t>
+      </w:r>
+      <w:proofErr w:type="spellEnd"/>
+      <w:r>
+        <w:rPr>
+          <w:color w:val="FF0000"/>
+        </w:rPr>
+        <w:t xml:space="preserve"> == 'tribal' %}</w:t>
       </w:r>
     </w:p>
     <w:p>
@@ -687,122 +715,440 @@
     </w:p>
     <w:p>
       <w:pPr>
-        <w:pStyle w:val="Body"/>
-      </w:pPr>
-      <w:r>
-        <w:t xml:space="preserve">If you fill out your </w:t>
-      </w:r>
-      <w:r>
-        <w:t>forms</w:t>
-      </w:r>
-      <w:r>
-        <w:t xml:space="preserve"> on a computer and file them with TrueFiling, you can sign your forms electronically. Type “/s/ your name” on the signature line. For example, Zoe Lee’s signature would be "/s/ Zoe Lee."</w:t>
+        <w:pStyle w:val="Example"/>
+        <w:rPr>
+          <w:color w:val="auto"/>
+        </w:rPr>
+      </w:pPr>
+      <w:r>
+        <w:t>Important - signing your documents</w:t>
       </w:r>
     </w:p>
     <w:p>
       <w:pPr>
-        <w:pStyle w:val="Body"/>
-      </w:pPr>
-      <w:r>
-        <w:lastRenderedPageBreak/>
-        <w:t>If you fill out paper copies of the forms, or do not file them with TrueFiling, read</w:t>
-      </w:r>
-      <w:r>
-        <w:t xml:space="preserve"> {{ sign_step.subject }}</w:t>
+        <w:rPr>
+          <w:rFonts w:ascii="Helvetica" w:eastAsiaTheme="minorHAnsi" w:hAnsi="Helvetica" w:cs="Helvetica"/>
+          <w:sz w:val="24"/>
+          <w:szCs w:val="24"/>
+        </w:rPr>
+      </w:pPr>
+      <w:r>
+        <w:rPr>
+          <w:rFonts w:ascii="Helvetica" w:eastAsiaTheme="minorHAnsi" w:hAnsi="Helvetica" w:cs="Helvetica"/>
+          <w:color w:val="FF0000"/>
+          <w:sz w:val="24"/>
+          <w:szCs w:val="24"/>
+        </w:rPr>
+        <w:t>{%p</w:t>
+      </w:r>
+      <w:r>
+        <w:rPr>
+          <w:rFonts w:ascii="Helvetica" w:eastAsiaTheme="minorHAnsi" w:hAnsi="Helvetica" w:cs="Helvetica"/>
+          <w:color w:val="FF0000"/>
+          <w:sz w:val="24"/>
+          <w:szCs w:val="24"/>
+        </w:rPr>
+        <w:t xml:space="preserve"> if filling_manner in('electronically', 'dunno') and filing_method in('efiling', 'dunno')</w:t>
+      </w:r>
+      <w:r>
+        <w:rPr>
+          <w:rFonts w:ascii="Helvetica" w:eastAsiaTheme="minorHAnsi" w:hAnsi="Helvetica" w:cs="Helvetica"/>
+          <w:color w:val="FF0000"/>
+          <w:sz w:val="24"/>
+          <w:szCs w:val="24"/>
+        </w:rPr>
+        <w:t xml:space="preserve"> %}</w:t>
       </w:r>
     </w:p>
     <w:p>
       <w:pPr>
-        <w:pStyle w:val="Body"/>
-      </w:pPr>
-      <w:r>
-        <w:rPr>
-          <w:color w:val="FF0000"/>
-        </w:rPr>
-        <w:t>{</w:t>
-      </w:r>
-      <w:r>
-        <w:rPr>
-          <w:color w:val="FF0000"/>
-        </w:rPr>
-        <w:t>%</w:t>
-      </w:r>
-      <w:r>
-        <w:rPr>
-          <w:color w:val="FF0000"/>
-        </w:rPr>
-        <w:t>p if user_need == '</w:t>
-      </w:r>
-      <w:r>
-        <w:rPr>
-          <w:color w:val="FF0000"/>
-        </w:rPr>
-        <w:t>change foreign custody order</w:t>
-      </w:r>
-      <w:r>
-        <w:rPr>
-          <w:color w:val="FF0000"/>
-        </w:rPr>
-        <w:t xml:space="preserve">' </w:t>
-      </w:r>
-      <w:r>
-        <w:rPr>
-          <w:color w:val="FF0000"/>
-        </w:rPr>
-        <w:t>%}</w:t>
+        <w:pStyle w:val="ExampleorImportantblock"/>
+      </w:pPr>
+      <w:r>
+        <w:lastRenderedPageBreak/>
+        <w:t>If you fill out your forms on a computer and file them with TrueFiling, you can sign your forms electronically. Type “/s/ your name” on the signature line. For example, Zoe Lee’s signature would be "/s/ Zoe Lee."</w:t>
       </w:r>
     </w:p>
     <w:p>
       <w:pPr>
-        <w:pStyle w:val="Heading3"/>
-      </w:pPr>
-      <w:r>
-        <w:t>Pay the filing fee of $150 or ask the court to waive it</w:t>
+        <w:rPr>
+          <w:rFonts w:ascii="Helvetica" w:eastAsiaTheme="minorHAnsi" w:hAnsi="Helvetica" w:cs="Helvetica"/>
+          <w:sz w:val="24"/>
+          <w:szCs w:val="24"/>
+        </w:rPr>
+      </w:pPr>
+      <w:r>
+        <w:rPr>
+          <w:rFonts w:ascii="Helvetica" w:eastAsiaTheme="minorHAnsi" w:hAnsi="Helvetica" w:cs="Helvetica"/>
+          <w:color w:val="FFC000"/>
+          <w:sz w:val="24"/>
+          <w:szCs w:val="24"/>
+        </w:rPr>
+        <w:t>{%p</w:t>
+      </w:r>
+      <w:r>
+        <w:rPr>
+          <w:rFonts w:ascii="Helvetica" w:eastAsiaTheme="minorHAnsi" w:hAnsi="Helvetica" w:cs="Helvetica"/>
+          <w:color w:val="FFC000"/>
+          <w:sz w:val="24"/>
+          <w:szCs w:val="24"/>
+        </w:rPr>
+        <w:t xml:space="preserve"> if</w:t>
+      </w:r>
+      <w:r>
+        <w:rPr>
+          <w:rFonts w:ascii="Helvetica" w:eastAsiaTheme="minorHAnsi" w:hAnsi="Helvetica" w:cs="Helvetica"/>
+          <w:color w:val="FFC000"/>
+          <w:sz w:val="24"/>
+          <w:szCs w:val="24"/>
+        </w:rPr>
+        <w:t xml:space="preserve"> </w:t>
+      </w:r>
+      <w:r>
+        <w:rPr>
+          <w:rFonts w:ascii="Helvetica" w:eastAsiaTheme="minorHAnsi" w:hAnsi="Helvetica" w:cs="Helvetica"/>
+          <w:color w:val="FFC000"/>
+          <w:sz w:val="24"/>
+          <w:szCs w:val="24"/>
+        </w:rPr>
+        <w:t>filling_manner == 'electronically'</w:t>
+      </w:r>
+      <w:r>
+        <w:rPr>
+          <w:rFonts w:ascii="Helvetica" w:eastAsiaTheme="minorHAnsi" w:hAnsi="Helvetica" w:cs="Helvetica"/>
+          <w:color w:val="FFC000"/>
+          <w:sz w:val="24"/>
+          <w:szCs w:val="24"/>
+        </w:rPr>
+        <w:t xml:space="preserve"> and</w:t>
+      </w:r>
+      <w:r>
+        <w:rPr>
+          <w:rFonts w:ascii="Helvetica" w:eastAsiaTheme="minorHAnsi" w:hAnsi="Helvetica" w:cs="Helvetica"/>
+          <w:color w:val="FFC000"/>
+          <w:sz w:val="24"/>
+          <w:szCs w:val="24"/>
+        </w:rPr>
+        <w:t xml:space="preserve"> filing_method == 'efiling'</w:t>
+      </w:r>
+      <w:r>
+        <w:rPr>
+          <w:rFonts w:ascii="Helvetica" w:eastAsiaTheme="minorHAnsi" w:hAnsi="Helvetica" w:cs="Helvetica"/>
+          <w:color w:val="FFC000"/>
+          <w:sz w:val="24"/>
+          <w:szCs w:val="24"/>
+        </w:rPr>
+        <w:t xml:space="preserve"> %}</w:t>
       </w:r>
     </w:p>
     <w:p>
       <w:pPr>
-        <w:pStyle w:val="Body"/>
-      </w:pPr>
-      <w:r>
-        <w:t>The fee to register a</w:t>
-      </w:r>
-      <w:r>
-        <w:t xml:space="preserve"> </w:t>
-      </w:r>
-      <w:r>
-        <w:t>custody order</w:t>
-      </w:r>
-      <w:r>
-        <w:t xml:space="preserve"> </w:t>
-      </w:r>
-      <w:r>
-        <w:t xml:space="preserve">from {{ "a tribal court" if </w:t>
-      </w:r>
-      <w:r>
-        <w:t xml:space="preserve">foreign_court_type == 'tribal' </w:t>
-      </w:r>
-      <w:r>
-        <w:t>else "another state</w:t>
-      </w:r>
-      <w:r>
-        <w:t xml:space="preserve"> or tribe</w:t>
-      </w:r>
-      <w:r>
-        <w:t>" }}</w:t>
-      </w:r>
-      <w:r>
-        <w:t xml:space="preserve"> is </w:t>
-      </w:r>
-      <w:r>
-        <w:t>$150.</w:t>
+        <w:pStyle w:val="ExampleorImportantblock"/>
+      </w:pPr>
+      <w:r>
+        <w:t xml:space="preserve">If the form needs to be notarized, fill out and file </w:t>
+      </w:r>
+      <w:r>
+        <w:rPr>
+          <w:b/>
+          <w:bCs/>
+        </w:rPr>
+        <w:t>Self-Certification (No Notary Available), TF-835</w:t>
+      </w:r>
+      <w:r>
+        <w:t xml:space="preserve"> [</w:t>
+      </w:r>
+      <w:hyperlink r:id="rId15" w:history="1">
+        <w:r>
+          <w:rPr>
+            <w:rStyle w:val="Hyperlink"/>
+            <w:spacing w:val="0"/>
+          </w:rPr>
+          <w:t>Fill in PDF</w:t>
+        </w:r>
+      </w:hyperlink>
+      <w:r>
+        <w:t>]</w:t>
+      </w:r>
+      <w:r>
+        <w:br/>
+      </w:r>
+      <w:hyperlink r:id="rId16" w:history="1">
+        <w:r>
+          <w:rPr>
+            <w:rStyle w:val="Hyperlink"/>
+            <w:spacing w:val="0"/>
+          </w:rPr>
+          <w:t>ak-courts.info/tf835</w:t>
+        </w:r>
+      </w:hyperlink>
+      <w:r>
+        <w:t>.</w:t>
       </w:r>
     </w:p>
     <w:p>
       <w:pPr>
+        <w:rPr>
+          <w:rFonts w:ascii="Helvetica" w:eastAsiaTheme="minorHAnsi" w:hAnsi="Helvetica" w:cs="Helvetica"/>
+          <w:sz w:val="24"/>
+          <w:szCs w:val="24"/>
+        </w:rPr>
+      </w:pPr>
+      <w:r>
+        <w:rPr>
+          <w:rFonts w:ascii="Helvetica" w:eastAsiaTheme="minorHAnsi" w:hAnsi="Helvetica" w:cs="Helvetica"/>
+          <w:color w:val="FFC000"/>
+          <w:sz w:val="24"/>
+          <w:szCs w:val="24"/>
+        </w:rPr>
+        <w:t>{%p</w:t>
+      </w:r>
+      <w:r>
+        <w:rPr>
+          <w:rFonts w:ascii="Helvetica" w:eastAsiaTheme="minorHAnsi" w:hAnsi="Helvetica" w:cs="Helvetica"/>
+          <w:color w:val="FFC000"/>
+          <w:sz w:val="24"/>
+          <w:szCs w:val="24"/>
+        </w:rPr>
+        <w:t xml:space="preserve"> endi</w:t>
+      </w:r>
+      <w:r>
+        <w:rPr>
+          <w:rFonts w:ascii="Helvetica" w:eastAsiaTheme="minorHAnsi" w:hAnsi="Helvetica" w:cs="Helvetica"/>
+          <w:color w:val="FFC000"/>
+          <w:sz w:val="24"/>
+          <w:szCs w:val="24"/>
+        </w:rPr>
+        <w:t>f %}</w:t>
+      </w:r>
+    </w:p>
+    <w:p>
+      <w:pPr>
+        <w:rPr>
+          <w:rFonts w:ascii="Helvetica" w:eastAsiaTheme="minorHAnsi" w:hAnsi="Helvetica" w:cs="Helvetica"/>
+          <w:sz w:val="24"/>
+          <w:szCs w:val="24"/>
+        </w:rPr>
+      </w:pPr>
+      <w:r>
+        <w:rPr>
+          <w:rFonts w:ascii="Helvetica" w:eastAsiaTheme="minorHAnsi" w:hAnsi="Helvetica" w:cs="Helvetica"/>
+          <w:color w:val="FF0000"/>
+          <w:sz w:val="24"/>
+          <w:szCs w:val="24"/>
+        </w:rPr>
+        <w:t>{%p</w:t>
+      </w:r>
+      <w:r>
+        <w:rPr>
+          <w:rFonts w:ascii="Helvetica" w:eastAsiaTheme="minorHAnsi" w:hAnsi="Helvetica" w:cs="Helvetica"/>
+          <w:color w:val="FF0000"/>
+          <w:sz w:val="24"/>
+          <w:szCs w:val="24"/>
+        </w:rPr>
+        <w:t xml:space="preserve"> endi</w:t>
+      </w:r>
+      <w:r>
+        <w:rPr>
+          <w:rFonts w:ascii="Helvetica" w:eastAsiaTheme="minorHAnsi" w:hAnsi="Helvetica" w:cs="Helvetica"/>
+          <w:color w:val="FF0000"/>
+          <w:sz w:val="24"/>
+          <w:szCs w:val="24"/>
+        </w:rPr>
+        <w:t>f %}</w:t>
+      </w:r>
+    </w:p>
+    <w:p>
+      <w:pPr>
+        <w:rPr>
+          <w:rFonts w:ascii="Helvetica" w:eastAsiaTheme="minorHAnsi" w:hAnsi="Helvetica" w:cs="Helvetica"/>
+          <w:sz w:val="24"/>
+          <w:szCs w:val="24"/>
+        </w:rPr>
+      </w:pPr>
+      <w:r>
+        <w:rPr>
+          <w:rFonts w:ascii="Helvetica" w:eastAsiaTheme="minorHAnsi" w:hAnsi="Helvetica" w:cs="Helvetica"/>
+          <w:color w:val="FF0000"/>
+          <w:sz w:val="24"/>
+          <w:szCs w:val="24"/>
+        </w:rPr>
+        <w:t>{%p</w:t>
+      </w:r>
+      <w:r>
+        <w:rPr>
+          <w:rFonts w:ascii="Helvetica" w:eastAsiaTheme="minorHAnsi" w:hAnsi="Helvetica" w:cs="Helvetica"/>
+          <w:color w:val="FF0000"/>
+          <w:sz w:val="24"/>
+          <w:szCs w:val="24"/>
+        </w:rPr>
+        <w:t xml:space="preserve"> if filling_manner in('paper', 'dunno') or filing_method in ('mail or in person', 'dunno'</w:t>
+      </w:r>
+      <w:r>
+        <w:rPr>
+          <w:rFonts w:ascii="Helvetica" w:eastAsiaTheme="minorHAnsi" w:hAnsi="Helvetica" w:cs="Helvetica"/>
+          <w:color w:val="FF0000"/>
+          <w:sz w:val="24"/>
+          <w:szCs w:val="24"/>
+        </w:rPr>
+        <w:t>) %}</w:t>
+      </w:r>
+    </w:p>
+    <w:p>
+      <w:pPr>
+        <w:pStyle w:val="Exampleparagraph"/>
+      </w:pPr>
+      <w:r>
+        <w:t>If you fill out paper copies of the forms, or do not file them with TrueFiling, read</w:t>
+      </w:r>
+      <w:r>
+        <w:t xml:space="preserve"> {{ sign_step.subject }}</w:t>
+      </w:r>
+    </w:p>
+    <w:p>
+      <w:r>
+        <w:rPr>
+          <w:rFonts w:ascii="Helvetica" w:eastAsiaTheme="minorHAnsi" w:hAnsi="Helvetica" w:cs="Helvetica"/>
+          <w:color w:val="FF0000"/>
+          <w:sz w:val="24"/>
+          <w:szCs w:val="24"/>
+        </w:rPr>
+        <w:t>{%p</w:t>
+      </w:r>
+      <w:r>
+        <w:rPr>
+          <w:rFonts w:ascii="Helvetica" w:eastAsiaTheme="minorHAnsi" w:hAnsi="Helvetica" w:cs="Helvetica"/>
+          <w:color w:val="FF0000"/>
+          <w:sz w:val="24"/>
+          <w:szCs w:val="24"/>
+        </w:rPr>
+        <w:t xml:space="preserve"> </w:t>
+      </w:r>
+      <w:r>
+        <w:rPr>
+          <w:rFonts w:ascii="Helvetica" w:eastAsiaTheme="minorHAnsi" w:hAnsi="Helvetica" w:cs="Helvetica"/>
+          <w:color w:val="FF0000"/>
+          <w:sz w:val="24"/>
+          <w:szCs w:val="24"/>
+        </w:rPr>
+        <w:t>end</w:t>
+      </w:r>
+      <w:r>
+        <w:rPr>
+          <w:rFonts w:ascii="Helvetica" w:eastAsiaTheme="minorHAnsi" w:hAnsi="Helvetica" w:cs="Helvetica"/>
+          <w:color w:val="FF0000"/>
+          <w:sz w:val="24"/>
+          <w:szCs w:val="24"/>
+        </w:rPr>
+        <w:t>if</w:t>
+      </w:r>
+      <w:r>
+        <w:rPr>
+          <w:rFonts w:ascii="Helvetica" w:eastAsiaTheme="minorHAnsi" w:hAnsi="Helvetica" w:cs="Helvetica"/>
+          <w:color w:val="FF0000"/>
+          <w:sz w:val="24"/>
+          <w:szCs w:val="24"/>
+        </w:rPr>
+        <w:t xml:space="preserve"> %}</w:t>
+      </w:r>
+    </w:p>
+    <w:p>
+      <w:pPr>
         <w:pStyle w:val="Body"/>
       </w:pPr>
       <w:r>
+        <w:rPr>
+          <w:color w:val="FF0000"/>
+        </w:rPr>
+        <w:t>{</w:t>
+      </w:r>
+      <w:r>
+        <w:rPr>
+          <w:color w:val="FF0000"/>
+        </w:rPr>
+        <w:t>%</w:t>
+      </w:r>
+      <w:r>
+        <w:rPr>
+          <w:color w:val="FF0000"/>
+        </w:rPr>
+        <w:t>p if user_need == '</w:t>
+      </w:r>
+      <w:r>
+        <w:rPr>
+          <w:color w:val="FF0000"/>
+        </w:rPr>
+        <w:t>change foreign custody order</w:t>
+      </w:r>
+      <w:r>
+        <w:rPr>
+          <w:color w:val="FF0000"/>
+        </w:rPr>
+        <w:t xml:space="preserve">' </w:t>
+      </w:r>
+      <w:r>
+        <w:rPr>
+          <w:color w:val="FF0000"/>
+        </w:rPr>
+        <w:t>%}</w:t>
+      </w:r>
+    </w:p>
+    <w:p>
+      <w:pPr>
+        <w:pStyle w:val="Heading3"/>
+      </w:pPr>
+      <w:r>
+        <w:t>Pay the filing fee of $150 or ask the court to waive it</w:t>
+      </w:r>
+    </w:p>
+    <w:p>
+      <w:pPr>
+        <w:pStyle w:val="Body"/>
+      </w:pPr>
+      <w:r>
+        <w:t>The fee to register a</w:t>
+      </w:r>
+      <w:r>
+        <w:t xml:space="preserve"> </w:t>
+      </w:r>
+      <w:r>
+        <w:t>custody order</w:t>
+      </w:r>
+      <w:r>
+        <w:t xml:space="preserve"> </w:t>
+      </w:r>
+      <w:r>
+        <w:t xml:space="preserve">from {{ "a tribal court" if </w:t>
+      </w:r>
+      <w:proofErr w:type="spellStart"/>
+      <w:r>
+        <w:t>foreign_court_type</w:t>
+      </w:r>
+      <w:proofErr w:type="spellEnd"/>
+      <w:r>
+        <w:t xml:space="preserve"> == 'tribal' </w:t>
+      </w:r>
+      <w:r>
+        <w:t>else "another state</w:t>
+      </w:r>
+      <w:r>
+        <w:t xml:space="preserve"> or tribe</w:t>
+      </w:r>
+      <w:r>
+        <w:t>" }}</w:t>
+      </w:r>
+      <w:r>
+        <w:t xml:space="preserve"> is </w:t>
+      </w:r>
+      <w:r>
+        <w:t>$150.</w:t>
+      </w:r>
+    </w:p>
+    <w:p>
+      <w:pPr>
+        <w:pStyle w:val="Body"/>
+      </w:pPr>
+      <w:r>
         <w:t xml:space="preserve">If you cannot afford $150, you can file a </w:t>
       </w:r>
       <w:r>
@@ -895,7 +1241,7 @@
       <w:r>
         <w:t>[</w:t>
       </w:r>
-      <w:hyperlink r:id="rId15" w:history="1">
+      <w:hyperlink r:id="rId17" w:history="1">
         <w:r>
           <w:rPr>
             <w:rStyle w:val="Hyperlink"/>
@@ -909,7 +1255,7 @@
       <w:r>
         <w:br/>
       </w:r>
-      <w:hyperlink r:id="rId16" w:history="1">
+      <w:hyperlink r:id="rId18" w:history="1">
         <w:r>
           <w:rPr>
             <w:rStyle w:val="Hyperlink"/>
@@ -946,12 +1292,12 @@
       </w:r>
     </w:p>
     <w:sectPr>
-      <w:headerReference w:type="even" r:id="rId17"/>
-      <w:headerReference w:type="default" r:id="rId18"/>
-      <w:footerReference w:type="even" r:id="rId19"/>
-      <w:footerReference w:type="default" r:id="rId20"/>
-      <w:headerReference w:type="first" r:id="rId21"/>
-      <w:footerReference w:type="first" r:id="rId22"/>
+      <w:headerReference w:type="even" r:id="rId19"/>
+      <w:headerReference w:type="default" r:id="rId20"/>
+      <w:footerReference w:type="even" r:id="rId21"/>
+      <w:footerReference w:type="default" r:id="rId22"/>
+      <w:headerReference w:type="first" r:id="rId23"/>
+      <w:footerReference w:type="first" r:id="rId24"/>
       <w:pgSz w:w="12240" w:h="15840"/>
       <w:pgMar w:top="1440" w:right="1440" w:bottom="1440" w:left="1440" w:header="720" w:footer="720" w:gutter="0"/>
       <w:cols w:space="720"/>

</xml_diff>